<commit_message>
Raise budget to 40 mln so'm with justified line items
Team pay, 2-month field survey, 12 months of server and map services,
test phones, pilot promotion; form, decks and posters updated.

Co-Authored-By: Claude Opus 5.5 <noreply@anthropic.com>
Claude-Session: https://claude.ai/code/session_017dewjmXWsdw8i5nM1B52Sq
</commit_message>
<xml_diff>
--- a/docs/Eng_yaxshi_kreativ_goya_Bekat_Qodirov_Ulugbek.docx
+++ b/docs/Eng_yaxshi_kreativ_goya_Bekat_Qodirov_Ulugbek.docx
@@ -3121,7 +3121,7 @@
               <w:rPr>
                 <w:sz w:val="18"/>
               </w:rPr>
-              <w:t>18 000 000 so‘m (ma’lumot yig‘ish, server, xarita xizmatlari, dizayn va pilot xarajatlari)</w:t>
+              <w:t>40 000 000 so‘m (jamoa mehnati, dala tadqiqoti, 12 oylik server va xarita xizmatlari, test qurilmalari, dizayn, pilot va targ‘ibot)</w:t>
             </w:r>
           </w:p>
         </w:tc>
@@ -7525,7 +7525,7 @@
               <w:rPr>
                 <w:sz w:val="15"/>
               </w:rPr>
-              <w:t>Dala tadqiqoti: yo‘nalishlar va bekatlarni GPS bilan belgilash</w:t>
+              <w:t>Jamoa mehnat haqi (2 muallif)</w:t>
             </w:r>
           </w:p>
         </w:tc>
@@ -7553,7 +7553,7 @@
               <w:rPr>
                 <w:sz w:val="15"/>
               </w:rPr>
-              <w:t>2 kishi × 1 oy</w:t>
+              <w:t>2 kishi × 3 oy</w:t>
             </w:r>
           </w:p>
         </w:tc>
@@ -7581,7 +7581,7 @@
               <w:rPr>
                 <w:sz w:val="15"/>
               </w:rPr>
-              <w:t>2 000 000 so‘m</w:t>
+              <w:t>1 500 000 so‘m</w:t>
             </w:r>
           </w:p>
         </w:tc>
@@ -7609,7 +7609,7 @@
               <w:rPr>
                 <w:sz w:val="15"/>
               </w:rPr>
-              <w:t>4 000 000 so‘m</w:t>
+              <w:t>9 000 000 so‘m</w:t>
             </w:r>
           </w:p>
         </w:tc>
@@ -7637,7 +7637,7 @@
               <w:rPr>
                 <w:sz w:val="15"/>
               </w:rPr>
-              <w:t>Barcha shahar yo‘nalishlarini bosib o‘tish, yo‘l kira, mobil internet</w:t>
+              <w:t>Ilova, marshrut algoritmi va ma’lumotlar bazasini ishlab chiqish, pilotni olib borish</w:t>
             </w:r>
           </w:p>
         </w:tc>
@@ -7696,7 +7696,7 @@
               <w:rPr>
                 <w:sz w:val="15"/>
               </w:rPr>
-              <w:t>Bulutli server (VPS)</w:t>
+              <w:t>Dala tadqiqoti: yo‘nalishlar va bekatlarni GPS bilan belgilash</w:t>
             </w:r>
           </w:p>
         </w:tc>
@@ -7724,7 +7724,7 @@
               <w:rPr>
                 <w:sz w:val="15"/>
               </w:rPr>
-              <w:t>6 oy</w:t>
+              <w:t>2 kishi × 2 oy</w:t>
             </w:r>
           </w:p>
         </w:tc>
@@ -7752,7 +7752,7 @@
               <w:rPr>
                 <w:sz w:val="15"/>
               </w:rPr>
-              <w:t>350 000 so‘m</w:t>
+              <w:t>2 000 000 so‘m</w:t>
             </w:r>
           </w:p>
         </w:tc>
@@ -7780,7 +7780,7 @@
               <w:rPr>
                 <w:sz w:val="15"/>
               </w:rPr>
-              <w:t>2 100 000 so‘m</w:t>
+              <w:t>8 000 000 so‘m</w:t>
             </w:r>
           </w:p>
         </w:tc>
@@ -7808,7 +7808,7 @@
               <w:rPr>
                 <w:sz w:val="15"/>
               </w:rPr>
-              <w:t>Ma’lumotlar bazasi yangilanishlari va talab tahlili uchun</w:t>
+              <w:t>Barcha yo‘nalishlarni ikki tomonga bosib o‘tish, kunning turli soatlarida qatnov oralig‘ini o‘lchash, yo‘l kira, mobil internet</w:t>
             </w:r>
           </w:p>
         </w:tc>
@@ -7888,7 +7888,7 @@
               <w:rPr>
                 <w:sz w:val="15"/>
               </w:rPr>
-              <w:t>6 oy</w:t>
+              <w:t>12 oy</w:t>
             </w:r>
           </w:p>
         </w:tc>
@@ -7944,7 +7944,7 @@
               <w:rPr>
                 <w:sz w:val="15"/>
               </w:rPr>
-              <w:t>2 400 000 so‘m</w:t>
+              <w:t>4 800 000 so‘m</w:t>
             </w:r>
           </w:p>
         </w:tc>
@@ -8004,6 +8004,341 @@
                 <w:sz w:val="15"/>
               </w:rPr>
               <w:t>4</w:t>
+            </w:r>
+          </w:p>
+        </w:tc>
+        <w:tc>
+          <w:tcPr>
+            <w:tcBorders/>
+            <w:tcW w:w="1747" w:type="dxa"/>
+            <w:vAlign w:val="center"/>
+          </w:tcPr>
+          <w:p>
+            <w:pPr>
+              <w:pStyle w:val="937"/>
+              <w:widowControl w:val="true"/>
+              <w:pBdr/>
+              <w:spacing w:after="0" w:before="0" w:line="240" w:lineRule="auto"/>
+              <w:ind/>
+              <w:jc w:val="left"/>
+              <w:rPr>
+                <w:rFonts w:eastAsia="ＭＳ 明朝"/>
+                <w:szCs w:val="22"/>
+                <w:lang w:val="en-US" w:eastAsia="en-US" w:bidi="ar-SA"/>
+              </w:rPr>
+            </w:pPr>
+            <w:r>
+              <w:rPr>
+                <w:sz w:val="15"/>
+              </w:rPr>
+              <w:t>Bulutli server (VPS)</w:t>
+            </w:r>
+          </w:p>
+        </w:tc>
+        <w:tc>
+          <w:tcPr>
+            <w:tcBorders/>
+            <w:tcW w:w="1747" w:type="dxa"/>
+            <w:vAlign w:val="center"/>
+          </w:tcPr>
+          <w:p>
+            <w:pPr>
+              <w:pStyle w:val="937"/>
+              <w:widowControl w:val="true"/>
+              <w:pBdr/>
+              <w:spacing w:after="0" w:before="0" w:line="240" w:lineRule="auto"/>
+              <w:ind/>
+              <w:jc w:val="left"/>
+              <w:rPr>
+                <w:rFonts w:eastAsia="ＭＳ 明朝"/>
+                <w:szCs w:val="22"/>
+                <w:lang w:val="en-US" w:eastAsia="en-US" w:bidi="ar-SA"/>
+              </w:rPr>
+            </w:pPr>
+            <w:r>
+              <w:rPr>
+                <w:sz w:val="15"/>
+              </w:rPr>
+              <w:t>12 oy</w:t>
+            </w:r>
+          </w:p>
+        </w:tc>
+        <w:tc>
+          <w:tcPr>
+            <w:tcBorders/>
+            <w:tcW w:w="1748" w:type="dxa"/>
+            <w:vAlign w:val="center"/>
+          </w:tcPr>
+          <w:p>
+            <w:pPr>
+              <w:pStyle w:val="937"/>
+              <w:widowControl w:val="true"/>
+              <w:pBdr/>
+              <w:spacing w:after="0" w:before="0" w:line="240" w:lineRule="auto"/>
+              <w:ind/>
+              <w:jc w:val="left"/>
+              <w:rPr>
+                <w:rFonts w:eastAsia="ＭＳ 明朝"/>
+                <w:szCs w:val="22"/>
+                <w:lang w:val="en-US" w:eastAsia="en-US" w:bidi="ar-SA"/>
+              </w:rPr>
+            </w:pPr>
+            <w:r>
+              <w:rPr>
+                <w:sz w:val="15"/>
+              </w:rPr>
+              <w:t>350 000 so‘m</w:t>
+            </w:r>
+          </w:p>
+        </w:tc>
+        <w:tc>
+          <w:tcPr>
+            <w:tcBorders/>
+            <w:tcW w:w="1746" w:type="dxa"/>
+            <w:vAlign w:val="center"/>
+          </w:tcPr>
+          <w:p>
+            <w:pPr>
+              <w:pStyle w:val="937"/>
+              <w:widowControl w:val="true"/>
+              <w:pBdr/>
+              <w:spacing w:after="0" w:before="0" w:line="240" w:lineRule="auto"/>
+              <w:ind/>
+              <w:jc w:val="left"/>
+              <w:rPr>
+                <w:rFonts w:eastAsia="ＭＳ 明朝"/>
+                <w:szCs w:val="22"/>
+                <w:lang w:val="en-US" w:eastAsia="en-US" w:bidi="ar-SA"/>
+              </w:rPr>
+            </w:pPr>
+            <w:r>
+              <w:rPr>
+                <w:sz w:val="15"/>
+              </w:rPr>
+              <w:t>4 200 000 so‘m</w:t>
+            </w:r>
+          </w:p>
+        </w:tc>
+        <w:tc>
+          <w:tcPr>
+            <w:tcBorders/>
+            <w:tcW w:w="1748" w:type="dxa"/>
+            <w:vAlign w:val="center"/>
+          </w:tcPr>
+          <w:p>
+            <w:pPr>
+              <w:pStyle w:val="937"/>
+              <w:widowControl w:val="true"/>
+              <w:pBdr/>
+              <w:spacing w:after="0" w:before="0" w:line="240" w:lineRule="auto"/>
+              <w:ind/>
+              <w:jc w:val="left"/>
+              <w:rPr>
+                <w:rFonts w:eastAsia="ＭＳ 明朝"/>
+                <w:szCs w:val="22"/>
+                <w:lang w:val="en-US" w:eastAsia="en-US" w:bidi="ar-SA"/>
+              </w:rPr>
+            </w:pPr>
+            <w:r>
+              <w:rPr>
+                <w:sz w:val="15"/>
+              </w:rPr>
+              <w:t>Ma’lumotlar bazasi yangilanishlari, veb-versiya va talab tahlili</w:t>
+            </w:r>
+          </w:p>
+        </w:tc>
+      </w:tr>
+      <w:tr>
+        <w:trPr/>
+        <w:tc>
+          <w:tcPr>
+            <w:tcBorders/>
+            <w:tcW w:w="1747" w:type="dxa"/>
+            <w:vAlign w:val="center"/>
+          </w:tcPr>
+          <w:p>
+            <w:pPr>
+              <w:pStyle w:val="937"/>
+              <w:widowControl w:val="true"/>
+              <w:pBdr/>
+              <w:spacing w:after="0" w:before="0" w:line="240" w:lineRule="auto"/>
+              <w:ind/>
+              <w:jc w:val="left"/>
+              <w:rPr>
+                <w:rFonts w:eastAsia="ＭＳ 明朝"/>
+                <w:szCs w:val="22"/>
+                <w:lang w:val="en-US" w:eastAsia="en-US" w:bidi="ar-SA"/>
+              </w:rPr>
+            </w:pPr>
+            <w:r>
+              <w:rPr>
+                <w:sz w:val="15"/>
+              </w:rPr>
+              <w:t>5</w:t>
+            </w:r>
+          </w:p>
+        </w:tc>
+        <w:tc>
+          <w:tcPr>
+            <w:tcBorders/>
+            <w:tcW w:w="1747" w:type="dxa"/>
+            <w:vAlign w:val="center"/>
+          </w:tcPr>
+          <w:p>
+            <w:pPr>
+              <w:pBdr/>
+              <w:spacing/>
+              <w:ind/>
+              <w:rPr/>
+            </w:pPr>
+            <w:r>
+              <w:rPr>
+                <w:sz w:val="15"/>
+              </w:rPr>
+              <w:t>Test smartfonlari (Android)</w:t>
+            </w:r>
+          </w:p>
+        </w:tc>
+        <w:tc>
+          <w:tcPr>
+            <w:tcBorders/>
+            <w:tcW w:w="1747" w:type="dxa"/>
+            <w:vAlign w:val="center"/>
+          </w:tcPr>
+          <w:p>
+            <w:pPr>
+              <w:pStyle w:val="937"/>
+              <w:widowControl w:val="true"/>
+              <w:pBdr/>
+              <w:spacing w:after="0" w:before="0" w:line="240" w:lineRule="auto"/>
+              <w:ind/>
+              <w:jc w:val="left"/>
+              <w:rPr>
+                <w:rFonts w:eastAsia="ＭＳ 明朝"/>
+                <w:szCs w:val="22"/>
+                <w:lang w:val="en-US" w:eastAsia="en-US" w:bidi="ar-SA"/>
+              </w:rPr>
+            </w:pPr>
+            <w:r>
+              <w:rPr>
+                <w:sz w:val="15"/>
+              </w:rPr>
+              <w:t>2 ta</w:t>
+            </w:r>
+          </w:p>
+        </w:tc>
+        <w:tc>
+          <w:tcPr>
+            <w:tcBorders/>
+            <w:tcW w:w="1748" w:type="dxa"/>
+            <w:vAlign w:val="center"/>
+          </w:tcPr>
+          <w:p>
+            <w:pPr>
+              <w:pStyle w:val="937"/>
+              <w:widowControl w:val="true"/>
+              <w:pBdr/>
+              <w:spacing w:after="0" w:before="0" w:line="240" w:lineRule="auto"/>
+              <w:ind/>
+              <w:jc w:val="left"/>
+              <w:rPr>
+                <w:rFonts w:eastAsia="ＭＳ 明朝"/>
+                <w:szCs w:val="22"/>
+                <w:lang w:val="en-US" w:eastAsia="en-US" w:bidi="ar-SA"/>
+              </w:rPr>
+            </w:pPr>
+            <w:r>
+              <w:rPr>
+                <w:sz w:val="15"/>
+              </w:rPr>
+              <w:t>1 800 000 so‘m</w:t>
+            </w:r>
+          </w:p>
+        </w:tc>
+        <w:tc>
+          <w:tcPr>
+            <w:tcBorders/>
+            <w:tcW w:w="1746" w:type="dxa"/>
+            <w:vAlign w:val="center"/>
+          </w:tcPr>
+          <w:p>
+            <w:pPr>
+              <w:pStyle w:val="937"/>
+              <w:widowControl w:val="true"/>
+              <w:pBdr/>
+              <w:spacing w:after="0" w:before="0" w:line="240" w:lineRule="auto"/>
+              <w:ind/>
+              <w:jc w:val="left"/>
+              <w:rPr>
+                <w:rFonts w:eastAsia="ＭＳ 明朝"/>
+                <w:szCs w:val="22"/>
+                <w:lang w:val="en-US" w:eastAsia="en-US" w:bidi="ar-SA"/>
+              </w:rPr>
+            </w:pPr>
+            <w:r>
+              <w:rPr>
+                <w:sz w:val="15"/>
+              </w:rPr>
+              <w:t>3 600 000 so‘m</w:t>
+            </w:r>
+          </w:p>
+        </w:tc>
+        <w:tc>
+          <w:tcPr>
+            <w:tcBorders/>
+            <w:tcW w:w="1748" w:type="dxa"/>
+            <w:vAlign w:val="center"/>
+          </w:tcPr>
+          <w:p>
+            <w:pPr>
+              <w:pStyle w:val="937"/>
+              <w:widowControl w:val="true"/>
+              <w:pBdr/>
+              <w:spacing w:after="0" w:before="0" w:line="240" w:lineRule="auto"/>
+              <w:ind/>
+              <w:jc w:val="left"/>
+              <w:rPr>
+                <w:rFonts w:eastAsia="ＭＳ 明朝"/>
+                <w:szCs w:val="22"/>
+                <w:lang w:val="en-US" w:eastAsia="en-US" w:bidi="ar-SA"/>
+              </w:rPr>
+            </w:pPr>
+            <w:r>
+              <w:rPr>
+                <w:sz w:val="15"/>
+              </w:rPr>
+              <w:t>Arzon va o‘rta telefonlarda tezlik va qulaylikni sinash, dala tadqiqotida GPS yozish</w:t>
+            </w:r>
+          </w:p>
+        </w:tc>
+      </w:tr>
+      <w:tr>
+        <w:trPr/>
+        <w:tc>
+          <w:tcPr>
+            <w:tcBorders/>
+            <w:tcW w:w="1747" w:type="dxa"/>
+            <w:vAlign w:val="center"/>
+          </w:tcPr>
+          <w:p>
+            <w:pPr>
+              <w:pStyle w:val="937"/>
+              <w:widowControl w:val="true"/>
+              <w:pBdr/>
+              <w:spacing w:after="0" w:before="0" w:line="240" w:lineRule="auto"/>
+              <w:ind/>
+              <w:jc w:val="left"/>
+              <w:rPr>
+                <w:rFonts w:eastAsia="ＭＳ 明朝"/>
+                <w:szCs w:val="22"/>
+                <w:lang w:val="en-US" w:eastAsia="en-US" w:bidi="ar-SA"/>
+              </w:rPr>
+            </w:pPr>
+            <w:r>
+              <w:rPr>
+                <w:sz w:val="15"/>
+              </w:rPr>
+              <w:t>6</w:t>
             </w:r>
           </w:p>
         </w:tc>
@@ -8174,7 +8509,7 @@
               <w:rPr>
                 <w:sz w:val="15"/>
               </w:rPr>
-              <w:t>5</w:t>
+              <w:t>7</w:t>
             </w:r>
           </w:p>
         </w:tc>
@@ -8186,10 +8521,188 @@
           </w:tcPr>
           <w:p>
             <w:pPr>
+              <w:pStyle w:val="937"/>
+              <w:widowControl w:val="true"/>
               <w:pBdr/>
-              <w:spacing/>
+              <w:spacing w:after="0" w:before="0" w:line="240" w:lineRule="auto"/>
               <w:ind/>
-              <w:rPr/>
+              <w:jc w:val="left"/>
+              <w:rPr>
+                <w:rFonts w:eastAsia="ＭＳ 明朝"/>
+                <w:szCs w:val="22"/>
+                <w:lang w:val="en-US" w:eastAsia="en-US" w:bidi="ar-SA"/>
+              </w:rPr>
+            </w:pPr>
+            <w:r>
+              <w:rPr>
+                <w:sz w:val="15"/>
+              </w:rPr>
+              <w:t>Pilot sinov va targ‘ibot</w:t>
+            </w:r>
+          </w:p>
+        </w:tc>
+        <w:tc>
+          <w:tcPr>
+            <w:tcBorders/>
+            <w:tcW w:w="1747" w:type="dxa"/>
+            <w:vAlign w:val="center"/>
+          </w:tcPr>
+          <w:p>
+            <w:pPr>
+              <w:pStyle w:val="937"/>
+              <w:widowControl w:val="true"/>
+              <w:pBdr/>
+              <w:spacing w:after="0" w:before="0" w:line="240" w:lineRule="auto"/>
+              <w:ind/>
+              <w:jc w:val="left"/>
+              <w:rPr>
+                <w:rFonts w:eastAsia="ＭＳ 明朝"/>
+                <w:szCs w:val="22"/>
+                <w:lang w:val="en-US" w:eastAsia="en-US" w:bidi="ar-SA"/>
+              </w:rPr>
+            </w:pPr>
+            <w:r>
+              <w:rPr>
+                <w:sz w:val="15"/>
+              </w:rPr>
+              <w:t>100+ foydalanuvchi</w:t>
+            </w:r>
+          </w:p>
+        </w:tc>
+        <w:tc>
+          <w:tcPr>
+            <w:tcBorders/>
+            <w:tcW w:w="1748" w:type="dxa"/>
+            <w:vAlign w:val="center"/>
+          </w:tcPr>
+          <w:p>
+            <w:pPr>
+              <w:pStyle w:val="937"/>
+              <w:widowControl w:val="true"/>
+              <w:pBdr/>
+              <w:spacing w:after="0" w:before="0" w:line="240" w:lineRule="auto"/>
+              <w:ind/>
+              <w:jc w:val="left"/>
+              <w:rPr>
+                <w:rFonts w:eastAsia="ＭＳ 明朝"/>
+                <w:szCs w:val="22"/>
+                <w:lang w:val="en-US" w:eastAsia="en-US" w:bidi="ar-SA"/>
+              </w:rPr>
+            </w:pPr>
+            <w:r>
+              <w:rPr>
+                <w:sz w:val="15"/>
+              </w:rPr>
+              <w:t>3 000 000 so‘m</w:t>
+            </w:r>
+          </w:p>
+        </w:tc>
+        <w:tc>
+          <w:tcPr>
+            <w:tcBorders/>
+            <w:tcW w:w="1746" w:type="dxa"/>
+            <w:vAlign w:val="center"/>
+          </w:tcPr>
+          <w:p>
+            <w:pPr>
+              <w:pStyle w:val="937"/>
+              <w:widowControl w:val="true"/>
+              <w:pBdr/>
+              <w:spacing w:after="0" w:before="0" w:line="240" w:lineRule="auto"/>
+              <w:ind/>
+              <w:jc w:val="left"/>
+              <w:rPr>
+                <w:rFonts w:eastAsia="ＭＳ 明朝"/>
+                <w:szCs w:val="22"/>
+                <w:lang w:val="en-US" w:eastAsia="en-US" w:bidi="ar-SA"/>
+              </w:rPr>
+            </w:pPr>
+            <w:r>
+              <w:rPr>
+                <w:sz w:val="15"/>
+              </w:rPr>
+              <w:t>3 000 000 so‘m</w:t>
+            </w:r>
+          </w:p>
+        </w:tc>
+        <w:tc>
+          <w:tcPr>
+            <w:tcBorders/>
+            <w:tcW w:w="1748" w:type="dxa"/>
+            <w:vAlign w:val="center"/>
+          </w:tcPr>
+          <w:p>
+            <w:pPr>
+              <w:pStyle w:val="937"/>
+              <w:widowControl w:val="true"/>
+              <w:pBdr/>
+              <w:spacing w:after="0" w:before="0" w:line="240" w:lineRule="auto"/>
+              <w:ind/>
+              <w:jc w:val="left"/>
+              <w:rPr>
+                <w:rFonts w:eastAsia="ＭＳ 明朝"/>
+                <w:szCs w:val="22"/>
+                <w:lang w:val="en-US" w:eastAsia="en-US" w:bidi="ar-SA"/>
+              </w:rPr>
+            </w:pPr>
+            <w:r>
+              <w:rPr>
+                <w:sz w:val="15"/>
+              </w:rPr>
+              <w:t>Bekatlar uchun QR-stikerlar va bosma sxemalar, so‘rovnoma, tarqatma materiallar</w:t>
+            </w:r>
+          </w:p>
+        </w:tc>
+      </w:tr>
+      <w:tr>
+        <w:trPr/>
+        <w:tc>
+          <w:tcPr>
+            <w:tcBorders/>
+            <w:tcW w:w="1747" w:type="dxa"/>
+            <w:vAlign w:val="center"/>
+          </w:tcPr>
+          <w:p>
+            <w:pPr>
+              <w:pStyle w:val="937"/>
+              <w:widowControl w:val="true"/>
+              <w:pBdr/>
+              <w:spacing w:after="0" w:before="0" w:line="240" w:lineRule="auto"/>
+              <w:ind/>
+              <w:jc w:val="left"/>
+              <w:rPr>
+                <w:rFonts w:eastAsia="ＭＳ 明朝"/>
+                <w:szCs w:val="22"/>
+                <w:lang w:val="en-US" w:eastAsia="en-US" w:bidi="ar-SA"/>
+              </w:rPr>
+            </w:pPr>
+            <w:r>
+              <w:rPr>
+                <w:sz w:val="15"/>
+              </w:rPr>
+              <w:t>8</w:t>
+            </w:r>
+          </w:p>
+        </w:tc>
+        <w:tc>
+          <w:tcPr>
+            <w:tcBorders/>
+            <w:tcW w:w="1747" w:type="dxa"/>
+            <w:vAlign w:val="center"/>
+          </w:tcPr>
+          <w:p>
+            <w:pPr>
+              <w:pStyle w:val="937"/>
+              <w:widowControl w:val="true"/>
+              <w:pBdr/>
+              <w:spacing w:after="0" w:before="0" w:line="240" w:lineRule="auto"/>
+              <w:ind/>
+              <w:jc w:val="left"/>
+              <w:rPr>
+                <w:rFonts w:eastAsia="ＭＳ 明朝"/>
+                <w:szCs w:val="22"/>
+                <w:lang w:val="en-US" w:eastAsia="en-US" w:bidi="ar-SA"/>
+              </w:rPr>
             </w:pPr>
             <w:r>
               <w:rPr>
@@ -8338,178 +8851,7 @@
               <w:rPr>
                 <w:sz w:val="15"/>
               </w:rPr>
-              <w:t>6</w:t>
-            </w:r>
-          </w:p>
-        </w:tc>
-        <w:tc>
-          <w:tcPr>
-            <w:tcBorders/>
-            <w:tcW w:w="1747" w:type="dxa"/>
-            <w:vAlign w:val="center"/>
-          </w:tcPr>
-          <w:p>
-            <w:pPr>
-              <w:pStyle w:val="937"/>
-              <w:widowControl w:val="true"/>
-              <w:pBdr/>
-              <w:spacing w:after="0" w:before="0" w:line="240" w:lineRule="auto"/>
-              <w:ind/>
-              <w:jc w:val="left"/>
-              <w:rPr>
-                <w:rFonts w:eastAsia="ＭＳ 明朝"/>
-                <w:szCs w:val="22"/>
-                <w:lang w:val="en-US" w:eastAsia="en-US" w:bidi="ar-SA"/>
-              </w:rPr>
-            </w:pPr>
-            <w:r>
-              <w:rPr>
-                <w:sz w:val="15"/>
-              </w:rPr>
-              <w:t>Pilot sinov</w:t>
-            </w:r>
-          </w:p>
-        </w:tc>
-        <w:tc>
-          <w:tcPr>
-            <w:tcBorders/>
-            <w:tcW w:w="1747" w:type="dxa"/>
-            <w:vAlign w:val="center"/>
-          </w:tcPr>
-          <w:p>
-            <w:pPr>
-              <w:pStyle w:val="937"/>
-              <w:widowControl w:val="true"/>
-              <w:pBdr/>
-              <w:spacing w:after="0" w:before="0" w:line="240" w:lineRule="auto"/>
-              <w:ind/>
-              <w:jc w:val="left"/>
-              <w:rPr>
-                <w:rFonts w:eastAsia="ＭＳ 明朝"/>
-                <w:szCs w:val="22"/>
-                <w:lang w:val="en-US" w:eastAsia="en-US" w:bidi="ar-SA"/>
-              </w:rPr>
-            </w:pPr>
-            <w:r>
-              <w:rPr>
-                <w:sz w:val="15"/>
-              </w:rPr>
-              <w:t>100+ foydalanuvchi</w:t>
-            </w:r>
-          </w:p>
-        </w:tc>
-        <w:tc>
-          <w:tcPr>
-            <w:tcBorders/>
-            <w:tcW w:w="1748" w:type="dxa"/>
-            <w:vAlign w:val="center"/>
-          </w:tcPr>
-          <w:p>
-            <w:pPr>
-              <w:pStyle w:val="937"/>
-              <w:widowControl w:val="true"/>
-              <w:pBdr/>
-              <w:spacing w:after="0" w:before="0" w:line="240" w:lineRule="auto"/>
-              <w:ind/>
-              <w:jc w:val="left"/>
-              <w:rPr>
-                <w:rFonts w:eastAsia="ＭＳ 明朝"/>
-                <w:szCs w:val="22"/>
-                <w:lang w:val="en-US" w:eastAsia="en-US" w:bidi="ar-SA"/>
-              </w:rPr>
-            </w:pPr>
-            <w:r>
-              <w:rPr>
-                <w:sz w:val="15"/>
-              </w:rPr>
-              <w:t>1 paket</w:t>
-            </w:r>
-          </w:p>
-        </w:tc>
-        <w:tc>
-          <w:tcPr>
-            <w:tcBorders/>
-            <w:tcW w:w="1746" w:type="dxa"/>
-            <w:vAlign w:val="center"/>
-          </w:tcPr>
-          <w:p>
-            <w:pPr>
-              <w:pStyle w:val="937"/>
-              <w:widowControl w:val="true"/>
-              <w:pBdr/>
-              <w:spacing w:after="0" w:before="0" w:line="240" w:lineRule="auto"/>
-              <w:ind/>
-              <w:jc w:val="left"/>
-              <w:rPr>
-                <w:rFonts w:eastAsia="ＭＳ 明朝"/>
-                <w:szCs w:val="22"/>
-                <w:lang w:val="en-US" w:eastAsia="en-US" w:bidi="ar-SA"/>
-              </w:rPr>
-            </w:pPr>
-            <w:r>
-              <w:rPr>
-                <w:sz w:val="15"/>
-              </w:rPr>
-              <w:t>2 000 000 so‘m</w:t>
-            </w:r>
-          </w:p>
-        </w:tc>
-        <w:tc>
-          <w:tcPr>
-            <w:tcBorders/>
-            <w:tcW w:w="1748" w:type="dxa"/>
-            <w:vAlign w:val="center"/>
-          </w:tcPr>
-          <w:p>
-            <w:pPr>
-              <w:pStyle w:val="937"/>
-              <w:widowControl w:val="true"/>
-              <w:pBdr/>
-              <w:spacing w:after="0" w:before="0" w:line="240" w:lineRule="auto"/>
-              <w:ind/>
-              <w:jc w:val="left"/>
-              <w:rPr>
-                <w:rFonts w:eastAsia="ＭＳ 明朝"/>
-                <w:szCs w:val="22"/>
-                <w:lang w:val="en-US" w:eastAsia="en-US" w:bidi="ar-SA"/>
-              </w:rPr>
-            </w:pPr>
-            <w:r>
-              <w:rPr>
-                <w:sz w:val="15"/>
-              </w:rPr>
-              <w:t>So‘rovnoma, sinov qurilmalari, tarqatma materiallar</w:t>
-            </w:r>
-          </w:p>
-        </w:tc>
-      </w:tr>
-      <w:tr>
-        <w:trPr/>
-        <w:tc>
-          <w:tcPr>
-            <w:tcBorders/>
-            <w:tcW w:w="1747" w:type="dxa"/>
-            <w:vAlign w:val="center"/>
-          </w:tcPr>
-          <w:p>
-            <w:pPr>
-              <w:pStyle w:val="937"/>
-              <w:widowControl w:val="true"/>
-              <w:pBdr/>
-              <w:spacing w:after="0" w:before="0" w:line="240" w:lineRule="auto"/>
-              <w:ind/>
-              <w:jc w:val="left"/>
-              <w:rPr>
-                <w:rFonts w:eastAsia="ＭＳ 明朝"/>
-                <w:szCs w:val="22"/>
-                <w:lang w:val="en-US" w:eastAsia="en-US" w:bidi="ar-SA"/>
-              </w:rPr>
-            </w:pPr>
-            <w:r>
-              <w:rPr>
-                <w:sz w:val="15"/>
-              </w:rPr>
-              <w:t>7</w:t>
+              <w:t>9</w:t>
             </w:r>
           </w:p>
         </w:tc>
@@ -8680,7 +9022,7 @@
               <w:rPr>
                 <w:sz w:val="15"/>
               </w:rPr>
-              <w:t>8</w:t>
+              <w:t>10</w:t>
             </w:r>
           </w:p>
         </w:tc>
@@ -8764,7 +9106,7 @@
               <w:rPr>
                 <w:sz w:val="15"/>
               </w:rPr>
-              <w:t>1 500 000 so‘m</w:t>
+              <w:t>1 400 000 so‘m</w:t>
             </w:r>
           </w:p>
         </w:tc>
@@ -8792,7 +9134,7 @@
               <w:rPr>
                 <w:sz w:val="15"/>
               </w:rPr>
-              <w:t>1 500 000 so‘m</w:t>
+              <w:t>1 400 000 so‘m</w:t>
             </w:r>
           </w:p>
         </w:tc>
@@ -8899,7 +9241,7 @@
               <w:rPr>
                 <w:sz w:val="15"/>
               </w:rPr>
-              <w:t>18 000 000 so‘m</w:t>
+              <w:t>40 000 000 so‘m</w:t>
             </w:r>
           </w:p>
         </w:tc>
@@ -8937,7 +9279,7 @@
         <w:pStyle w:val="1004"/>
       </w:pPr>
       <w:r>
-        <w:t>Eslatma: server va xarita xizmatlari 6 oyga hisoblangan — 3 oylik asosiy ishlar va pilot davri, qolgan muddat esa bazani yangilab borish va hokimlik bilan hamkorlikni boshlash uchun.</w:t>
+        <w:t>Eslatma: server va xarita xizmatlari 12 oyga hisoblangan — 3 oylik asosiy ishlar va pilot davri, qolgan 9 oy esa bazani yangilab borish, aholiga xizmat ko‘rsatish va hokimlik bilan hamkorlikni yo‘lga qo‘yish uchun.</w:t>
       </w:r>
     </w:p>
     <w:p>

</xml_diff>